<commit_message>
Per-family 'who claims whom' panels (replaces monolithic figB in the post); fix name+creator double-count in claim composition (figB/fig3/fig10/panels); full-res docx builder
Co-Authored-By: Claude Opus 4.8 <noreply@anthropic.com>
Claude-Session: https://claude.ai/code/session_01Anj4JvuNgPGS3kunnJgPkZ
</commit_message>
<xml_diff>
--- a/post/model_identity_v2_post.docx
+++ b/post/model_identity_v2_post.docx
@@ -166,7 +166,7 @@
       <w:r>
         <w:drawing>
           <wp:inline xmlns:a="http://schemas.openxmlformats.org/drawingml/2006/main" xmlns:pic="http://schemas.openxmlformats.org/drawingml/2006/picture">
-            <wp:extent cx="5852160" cy="17203839"/>
+            <wp:extent cx="5852160" cy="17222251"/>
             <wp:docPr id="1" name="Picture 1"/>
             <wp:cNvGraphicFramePr>
               <a:graphicFrameLocks noChangeAspect="1"/>
@@ -187,7 +187,7 @@
                   <pic:spPr>
                     <a:xfrm>
                       <a:off x="0" y="0"/>
-                      <a:ext cx="5852160" cy="17203839"/>
+                      <a:ext cx="5852160" cy="17222251"/>
                     </a:xfrm>
                     <a:prstGeom prst="rect"/>
                   </pic:spPr>
@@ -283,7 +283,7 @@
       <w:r>
         <w:drawing>
           <wp:inline xmlns:a="http://schemas.openxmlformats.org/drawingml/2006/main" xmlns:pic="http://schemas.openxmlformats.org/drawingml/2006/picture">
-            <wp:extent cx="5852160" cy="2754981"/>
+            <wp:extent cx="5852160" cy="2747820"/>
             <wp:docPr id="3" name="Picture 3"/>
             <wp:cNvGraphicFramePr>
               <a:graphicFrameLocks noChangeAspect="1"/>
@@ -304,7 +304,7 @@
                   <pic:spPr>
                     <a:xfrm>
                       <a:off x="0" y="0"/>
-                      <a:ext cx="5852160" cy="2754981"/>
+                      <a:ext cx="5852160" cy="2747820"/>
                     </a:xfrm>
                     <a:prstGeom prst="rect"/>
                   </pic:spPr>
@@ -394,60 +394,8 @@
       <w:r>
         <w:drawing>
           <wp:inline xmlns:a="http://schemas.openxmlformats.org/drawingml/2006/main" xmlns:pic="http://schemas.openxmlformats.org/drawingml/2006/picture">
-            <wp:extent cx="5852160" cy="17761071"/>
+            <wp:extent cx="5852160" cy="3708959"/>
             <wp:docPr id="4" name="Picture 4"/>
-            <wp:cNvGraphicFramePr>
-              <a:graphicFrameLocks noChangeAspect="1"/>
-            </wp:cNvGraphicFramePr>
-            <a:graphic>
-              <a:graphicData uri="http://schemas.openxmlformats.org/drawingml/2006/picture">
-                <pic:pic>
-                  <pic:nvPicPr>
-                    <pic:cNvPr id="0" name="figB_all_models_heatmap.png"/>
-                    <pic:cNvPicPr/>
-                  </pic:nvPicPr>
-                  <pic:blipFill>
-                    <a:blip r:embed="rId12"/>
-                    <a:stretch>
-                      <a:fillRect/>
-                    </a:stretch>
-                  </pic:blipFill>
-                  <pic:spPr>
-                    <a:xfrm>
-                      <a:off x="0" y="0"/>
-                      <a:ext cx="5852160" cy="17761071"/>
-                    </a:xfrm>
-                    <a:prstGeom prst="rect"/>
-                  </pic:spPr>
-                </pic:pic>
-              </a:graphicData>
-            </a:graphic>
-          </wp:inline>
-        </w:drawing>
-      </w:r>
-    </w:p>
-    <w:p>
-      <w:pPr>
-        <w:jc w:val="center"/>
-      </w:pPr>
-      <w:r>
-        <w:rPr>
-          <w:i/>
-          <w:color w:val="52514E"/>
-          <w:sz w:val="17"/>
-        </w:rPr>
-        <w:t>Figure B — all 177 models (grouped by family) × claimed identity; heat = % of that model's records claiming that identity.</w:t>
-      </w:r>
-    </w:p>
-    <w:p>
-      <w:pPr>
-        <w:jc w:val="center"/>
-      </w:pPr>
-      <w:r>
-        <w:drawing>
-          <wp:inline xmlns:a="http://schemas.openxmlformats.org/drawingml/2006/main" xmlns:pic="http://schemas.openxmlformats.org/drawingml/2006/picture">
-            <wp:extent cx="5852160" cy="3708959"/>
-            <wp:docPr id="5" name="Picture 5"/>
             <wp:cNvGraphicFramePr>
               <a:graphicFrameLocks noChangeAspect="1"/>
             </wp:cNvGraphicFramePr>
@@ -459,7 +407,7 @@
                     <pic:cNvPicPr/>
                   </pic:nvPicPr>
                   <pic:blipFill>
-                    <a:blip r:embed="rId13"/>
+                    <a:blip r:embed="rId12"/>
                     <a:stretch>
                       <a:fillRect/>
                     </a:stretch>
@@ -488,12 +436,12 @@
           <w:color w:val="52514E"/>
           <w:sz w:val="17"/>
         </w:rPr>
-        <w:t>Figure 3 — composition of each family's foreign claims (top 10 claimant families).</w:t>
+        <w:t>Figure 3 — composition of each family's foreign claims (top 10 claimant families). A record claiming "Claude, by Anthropic" counts once toward Claude.</w:t>
       </w:r>
     </w:p>
     <w:p>
       <w:r>
-        <w:t>2,421 foreign identity claims, and they are anything but uniform:</w:t>
+        <w:t>1,715 records carried a foreign identity claim (deduping name and creator within a record), and they are anything but uniform:</w:t>
       </w:r>
     </w:p>
     <w:p>
@@ -507,7 +455,7 @@
         <w:t>Kimi's claims are a ~97% Claude monoculture</w:t>
       </w:r>
       <w:r>
-        <w:t xml:space="preserve"> — the most concentrated single-target pattern in the data. MiniMax M2.7 is likewise Claude-dominant (claude×43, anthropic×40 of its claims). Old Qwen 2.5 models claim Anthropic/Claude in European languages.</w:t>
+        <w:t xml:space="preserve"> — the most concentrated single-target pattern in the data (Kimi K2 claims Claude on 44% of all its records). MiniMax M2.7 is likewise Claude-dominant (Claude on 40% of records). Old Qwen 2.5 models claim Anthropic/Claude in European languages.</w:t>
       </w:r>
     </w:p>
     <w:p>
@@ -532,10 +480,10 @@
         <w:rPr>
           <w:b/>
         </w:rPr>
-        <w:t>Poolside's Laguna M.1 claims NVIDIA/Nemotron</w:t>
+        <w:t>Poolside's Laguna M.1 claims NVIDIA/Nemotron on 55% of its records</w:t>
       </w:r>
       <w:r>
-        <w:t xml:space="preserve"> (66 of its claims) — its training-partner's models — while Laguna XS claims Qwen. Perceptron Mk1, a new lab's model, is an identity kaleidoscope (qwen/alibaba/openai/claude, 84% total).</w:t>
+        <w:t xml:space="preserve"> — its training-partner's models — while Laguna XS claims Qwen. Perceptron Mk1, a new lab's model, is an identity kaleidoscope (Qwen 37%, ChatGPT 16%, Claude 12%, Gemini 9%; 84% drift overall).</w:t>
       </w:r>
     </w:p>
     <w:p>
@@ -582,6 +530,1111 @@
     </w:p>
     <w:p>
       <w:pPr>
+        <w:pStyle w:val="Heading2"/>
+      </w:pPr>
+      <w:r>
+        <w:t>Family by family</w:t>
+      </w:r>
+    </w:p>
+    <w:p>
+      <w:r>
+        <w:t>Each panel below is one lab: its models that misidentified at least once (rows, sorted by rate) against the identities they claimed (columns; the number in a cell is the share of that model's ~120 records). Models that always self-identified are omitted and counted in each caption. Panels run in order of total family drift, so the heaviest cases come first; note the vertical gradient inside a family — that is the scrub-out (Figure 7) seen per-release.</w:t>
+      </w:r>
+    </w:p>
+    <w:p>
+      <w:pPr>
+        <w:jc w:val="center"/>
+      </w:pPr>
+      <w:r>
+        <w:drawing>
+          <wp:inline xmlns:a="http://schemas.openxmlformats.org/drawingml/2006/main" xmlns:pic="http://schemas.openxmlformats.org/drawingml/2006/picture">
+            <wp:extent cx="5394960" cy="5219433"/>
+            <wp:docPr id="5" name="Picture 5"/>
+            <wp:cNvGraphicFramePr>
+              <a:graphicFrameLocks noChangeAspect="1"/>
+            </wp:cNvGraphicFramePr>
+            <a:graphic>
+              <a:graphicData uri="http://schemas.openxmlformats.org/drawingml/2006/picture">
+                <pic:pic>
+                  <pic:nvPicPr>
+                    <pic:cNvPr id="0" name="fam_mistral.png"/>
+                    <pic:cNvPicPr/>
+                  </pic:nvPicPr>
+                  <pic:blipFill>
+                    <a:blip r:embed="rId13"/>
+                    <a:stretch>
+                      <a:fillRect/>
+                    </a:stretch>
+                  </pic:blipFill>
+                  <pic:spPr>
+                    <a:xfrm>
+                      <a:off x="0" y="0"/>
+                      <a:ext cx="5394960" cy="5219433"/>
+                    </a:xfrm>
+                    <a:prstGeom prst="rect"/>
+                  </pic:spPr>
+                </pic:pic>
+              </a:graphicData>
+            </a:graphic>
+          </wp:inline>
+        </w:drawing>
+      </w:r>
+    </w:p>
+    <w:p>
+      <w:pPr>
+        <w:jc w:val="center"/>
+      </w:pPr>
+      <w:r>
+        <w:rPr>
+          <w:i/>
+          <w:color w:val="52514E"/>
+          <w:sz w:val="17"/>
+        </w:rPr>
+        <w:t>Mistral: 16 of 16 models misidentified at least once; most-claimed: halluc./other, ChatGPT.</w:t>
+      </w:r>
+    </w:p>
+    <w:p>
+      <w:pPr>
+        <w:jc w:val="center"/>
+      </w:pPr>
+      <w:r>
+        <w:drawing>
+          <wp:inline xmlns:a="http://schemas.openxmlformats.org/drawingml/2006/main" xmlns:pic="http://schemas.openxmlformats.org/drawingml/2006/picture">
+            <wp:extent cx="5394960" cy="3208654"/>
+            <wp:docPr id="6" name="Picture 6"/>
+            <wp:cNvGraphicFramePr>
+              <a:graphicFrameLocks noChangeAspect="1"/>
+            </wp:cNvGraphicFramePr>
+            <a:graphic>
+              <a:graphicData uri="http://schemas.openxmlformats.org/drawingml/2006/picture">
+                <pic:pic>
+                  <pic:nvPicPr>
+                    <pic:cNvPr id="0" name="fam_kimi.png"/>
+                    <pic:cNvPicPr/>
+                  </pic:nvPicPr>
+                  <pic:blipFill>
+                    <a:blip r:embed="rId14"/>
+                    <a:stretch>
+                      <a:fillRect/>
+                    </a:stretch>
+                  </pic:blipFill>
+                  <pic:spPr>
+                    <a:xfrm>
+                      <a:off x="0" y="0"/>
+                      <a:ext cx="5394960" cy="3208654"/>
+                    </a:xfrm>
+                    <a:prstGeom prst="rect"/>
+                  </pic:spPr>
+                </pic:pic>
+              </a:graphicData>
+            </a:graphic>
+          </wp:inline>
+        </w:drawing>
+      </w:r>
+    </w:p>
+    <w:p>
+      <w:pPr>
+        <w:jc w:val="center"/>
+      </w:pPr>
+      <w:r>
+        <w:rPr>
+          <w:i/>
+          <w:color w:val="52514E"/>
+          <w:sz w:val="17"/>
+        </w:rPr>
+        <w:t>Moonshot (Kimi): 6 of 6 models misidentified at least once; most-claimed: Claude, ChatGPT.</w:t>
+      </w:r>
+    </w:p>
+    <w:p>
+      <w:pPr>
+        <w:jc w:val="center"/>
+      </w:pPr>
+      <w:r>
+        <w:drawing>
+          <wp:inline xmlns:a="http://schemas.openxmlformats.org/drawingml/2006/main" xmlns:pic="http://schemas.openxmlformats.org/drawingml/2006/picture">
+            <wp:extent cx="5394960" cy="2362936"/>
+            <wp:docPr id="7" name="Picture 7"/>
+            <wp:cNvGraphicFramePr>
+              <a:graphicFrameLocks noChangeAspect="1"/>
+            </wp:cNvGraphicFramePr>
+            <a:graphic>
+              <a:graphicData uri="http://schemas.openxmlformats.org/drawingml/2006/picture">
+                <pic:pic>
+                  <pic:nvPicPr>
+                    <pic:cNvPr id="0" name="fam_poolside.png"/>
+                    <pic:cNvPicPr/>
+                  </pic:nvPicPr>
+                  <pic:blipFill>
+                    <a:blip r:embed="rId15"/>
+                    <a:stretch>
+                      <a:fillRect/>
+                    </a:stretch>
+                  </pic:blipFill>
+                  <pic:spPr>
+                    <a:xfrm>
+                      <a:off x="0" y="0"/>
+                      <a:ext cx="5394960" cy="2362936"/>
+                    </a:xfrm>
+                    <a:prstGeom prst="rect"/>
+                  </pic:spPr>
+                </pic:pic>
+              </a:graphicData>
+            </a:graphic>
+          </wp:inline>
+        </w:drawing>
+      </w:r>
+    </w:p>
+    <w:p>
+      <w:pPr>
+        <w:jc w:val="center"/>
+      </w:pPr>
+      <w:r>
+        <w:rPr>
+          <w:i/>
+          <w:color w:val="52514E"/>
+          <w:sz w:val="17"/>
+        </w:rPr>
+        <w:t>Poolside (Laguna): 2 of 2 models misidentified at least once; most-claimed: NVIDIA, Qwen.</w:t>
+      </w:r>
+    </w:p>
+    <w:p>
+      <w:pPr>
+        <w:jc w:val="center"/>
+      </w:pPr>
+      <w:r>
+        <w:drawing>
+          <wp:inline xmlns:a="http://schemas.openxmlformats.org/drawingml/2006/main" xmlns:pic="http://schemas.openxmlformats.org/drawingml/2006/picture">
+            <wp:extent cx="5394960" cy="2861215"/>
+            <wp:docPr id="8" name="Picture 8"/>
+            <wp:cNvGraphicFramePr>
+              <a:graphicFrameLocks noChangeAspect="1"/>
+            </wp:cNvGraphicFramePr>
+            <a:graphic>
+              <a:graphicData uri="http://schemas.openxmlformats.org/drawingml/2006/picture">
+                <pic:pic>
+                  <pic:nvPicPr>
+                    <pic:cNvPr id="0" name="fam_nvidia.png"/>
+                    <pic:cNvPicPr/>
+                  </pic:nvPicPr>
+                  <pic:blipFill>
+                    <a:blip r:embed="rId16"/>
+                    <a:stretch>
+                      <a:fillRect/>
+                    </a:stretch>
+                  </pic:blipFill>
+                  <pic:spPr>
+                    <a:xfrm>
+                      <a:off x="0" y="0"/>
+                      <a:ext cx="5394960" cy="2861215"/>
+                    </a:xfrm>
+                    <a:prstGeom prst="rect"/>
+                  </pic:spPr>
+                </pic:pic>
+              </a:graphicData>
+            </a:graphic>
+          </wp:inline>
+        </w:drawing>
+      </w:r>
+    </w:p>
+    <w:p>
+      <w:pPr>
+        <w:jc w:val="center"/>
+      </w:pPr>
+      <w:r>
+        <w:rPr>
+          <w:i/>
+          <w:color w:val="52514E"/>
+          <w:sz w:val="17"/>
+        </w:rPr>
+        <w:t>NVIDIA (Nemotron): 5 of 5 models misidentified at least once; most-claimed: Qwen, ChatGPT.</w:t>
+      </w:r>
+    </w:p>
+    <w:p>
+      <w:pPr>
+        <w:jc w:val="center"/>
+      </w:pPr>
+      <w:r>
+        <w:drawing>
+          <wp:inline xmlns:a="http://schemas.openxmlformats.org/drawingml/2006/main" xmlns:pic="http://schemas.openxmlformats.org/drawingml/2006/picture">
+            <wp:extent cx="5394960" cy="5583616"/>
+            <wp:docPr id="9" name="Picture 9"/>
+            <wp:cNvGraphicFramePr>
+              <a:graphicFrameLocks noChangeAspect="1"/>
+            </wp:cNvGraphicFramePr>
+            <a:graphic>
+              <a:graphicData uri="http://schemas.openxmlformats.org/drawingml/2006/picture">
+                <pic:pic>
+                  <pic:nvPicPr>
+                    <pic:cNvPr id="0" name="fam_qwen.png"/>
+                    <pic:cNvPicPr/>
+                  </pic:nvPicPr>
+                  <pic:blipFill>
+                    <a:blip r:embed="rId17"/>
+                    <a:stretch>
+                      <a:fillRect/>
+                    </a:stretch>
+                  </pic:blipFill>
+                  <pic:spPr>
+                    <a:xfrm>
+                      <a:off x="0" y="0"/>
+                      <a:ext cx="5394960" cy="5583616"/>
+                    </a:xfrm>
+                    <a:prstGeom prst="rect"/>
+                  </pic:spPr>
+                </pic:pic>
+              </a:graphicData>
+            </a:graphic>
+          </wp:inline>
+        </w:drawing>
+      </w:r>
+    </w:p>
+    <w:p>
+      <w:pPr>
+        <w:jc w:val="center"/>
+      </w:pPr>
+      <w:r>
+        <w:rPr>
+          <w:i/>
+          <w:color w:val="52514E"/>
+          <w:sz w:val="17"/>
+        </w:rPr>
+        <w:t>Alibaba (Qwen): 20 of 34 models misidentified at least once (14 always self-identified); most-claimed: Claude, halluc./other.</w:t>
+      </w:r>
+    </w:p>
+    <w:p>
+      <w:pPr>
+        <w:jc w:val="center"/>
+      </w:pPr>
+      <w:r>
+        <w:drawing>
+          <wp:inline xmlns:a="http://schemas.openxmlformats.org/drawingml/2006/main" xmlns:pic="http://schemas.openxmlformats.org/drawingml/2006/picture">
+            <wp:extent cx="5394960" cy="2195281"/>
+            <wp:docPr id="10" name="Picture 10"/>
+            <wp:cNvGraphicFramePr>
+              <a:graphicFrameLocks noChangeAspect="1"/>
+            </wp:cNvGraphicFramePr>
+            <a:graphic>
+              <a:graphicData uri="http://schemas.openxmlformats.org/drawingml/2006/picture">
+                <pic:pic>
+                  <pic:nvPicPr>
+                    <pic:cNvPr id="0" name="fam_nous.png"/>
+                    <pic:cNvPicPr/>
+                  </pic:nvPicPr>
+                  <pic:blipFill>
+                    <a:blip r:embed="rId18"/>
+                    <a:stretch>
+                      <a:fillRect/>
+                    </a:stretch>
+                  </pic:blipFill>
+                  <pic:spPr>
+                    <a:xfrm>
+                      <a:off x="0" y="0"/>
+                      <a:ext cx="5394960" cy="2195281"/>
+                    </a:xfrm>
+                    <a:prstGeom prst="rect"/>
+                  </pic:spPr>
+                </pic:pic>
+              </a:graphicData>
+            </a:graphic>
+          </wp:inline>
+        </w:drawing>
+      </w:r>
+    </w:p>
+    <w:p>
+      <w:pPr>
+        <w:jc w:val="center"/>
+      </w:pPr>
+      <w:r>
+        <w:rPr>
+          <w:i/>
+          <w:color w:val="52514E"/>
+          <w:sz w:val="17"/>
+        </w:rPr>
+        <w:t>Nous (Hermes): 2 of 2 models misidentified at least once; most-claimed: halluc./other, ChatGPT.</w:t>
+      </w:r>
+    </w:p>
+    <w:p>
+      <w:pPr>
+        <w:jc w:val="center"/>
+      </w:pPr>
+      <w:r>
+        <w:drawing>
+          <wp:inline xmlns:a="http://schemas.openxmlformats.org/drawingml/2006/main" xmlns:pic="http://schemas.openxmlformats.org/drawingml/2006/picture">
+            <wp:extent cx="5394960" cy="3277867"/>
+            <wp:docPr id="11" name="Picture 11"/>
+            <wp:cNvGraphicFramePr>
+              <a:graphicFrameLocks noChangeAspect="1"/>
+            </wp:cNvGraphicFramePr>
+            <a:graphic>
+              <a:graphicData uri="http://schemas.openxmlformats.org/drawingml/2006/picture">
+                <pic:pic>
+                  <pic:nvPicPr>
+                    <pic:cNvPr id="0" name="fam_meta.png"/>
+                    <pic:cNvPicPr/>
+                  </pic:nvPicPr>
+                  <pic:blipFill>
+                    <a:blip r:embed="rId19"/>
+                    <a:stretch>
+                      <a:fillRect/>
+                    </a:stretch>
+                  </pic:blipFill>
+                  <pic:spPr>
+                    <a:xfrm>
+                      <a:off x="0" y="0"/>
+                      <a:ext cx="5394960" cy="3277867"/>
+                    </a:xfrm>
+                    <a:prstGeom prst="rect"/>
+                  </pic:spPr>
+                </pic:pic>
+              </a:graphicData>
+            </a:graphic>
+          </wp:inline>
+        </w:drawing>
+      </w:r>
+    </w:p>
+    <w:p>
+      <w:pPr>
+        <w:jc w:val="center"/>
+      </w:pPr>
+      <w:r>
+        <w:rPr>
+          <w:i/>
+          <w:color w:val="52514E"/>
+          <w:sz w:val="17"/>
+        </w:rPr>
+        <w:t>Meta (Llama): 7 of 7 models misidentified at least once; most-claimed: halluc./other, Gemini.</w:t>
+      </w:r>
+    </w:p>
+    <w:p>
+      <w:pPr>
+        <w:jc w:val="center"/>
+      </w:pPr>
+      <w:r>
+        <w:drawing>
+          <wp:inline xmlns:a="http://schemas.openxmlformats.org/drawingml/2006/main" xmlns:pic="http://schemas.openxmlformats.org/drawingml/2006/picture">
+            <wp:extent cx="5394960" cy="2397363"/>
+            <wp:docPr id="12" name="Picture 12"/>
+            <wp:cNvGraphicFramePr>
+              <a:graphicFrameLocks noChangeAspect="1"/>
+            </wp:cNvGraphicFramePr>
+            <a:graphic>
+              <a:graphicData uri="http://schemas.openxmlformats.org/drawingml/2006/picture">
+                <pic:pic>
+                  <pic:nvPicPr>
+                    <pic:cNvPr id="0" name="fam_reka.png"/>
+                    <pic:cNvPicPr/>
+                  </pic:nvPicPr>
+                  <pic:blipFill>
+                    <a:blip r:embed="rId20"/>
+                    <a:stretch>
+                      <a:fillRect/>
+                    </a:stretch>
+                  </pic:blipFill>
+                  <pic:spPr>
+                    <a:xfrm>
+                      <a:off x="0" y="0"/>
+                      <a:ext cx="5394960" cy="2397363"/>
+                    </a:xfrm>
+                    <a:prstGeom prst="rect"/>
+                  </pic:spPr>
+                </pic:pic>
+              </a:graphicData>
+            </a:graphic>
+          </wp:inline>
+        </w:drawing>
+      </w:r>
+    </w:p>
+    <w:p>
+      <w:pPr>
+        <w:jc w:val="center"/>
+      </w:pPr>
+      <w:r>
+        <w:rPr>
+          <w:i/>
+          <w:color w:val="52514E"/>
+          <w:sz w:val="17"/>
+        </w:rPr>
+        <w:t>Reka: 2 of 2 models misidentified at least once; most-claimed: halluc./other, ChatGPT.</w:t>
+      </w:r>
+    </w:p>
+    <w:p>
+      <w:pPr>
+        <w:jc w:val="center"/>
+      </w:pPr>
+      <w:r>
+        <w:drawing>
+          <wp:inline xmlns:a="http://schemas.openxmlformats.org/drawingml/2006/main" xmlns:pic="http://schemas.openxmlformats.org/drawingml/2006/picture">
+            <wp:extent cx="5394960" cy="3285372"/>
+            <wp:docPr id="13" name="Picture 13"/>
+            <wp:cNvGraphicFramePr>
+              <a:graphicFrameLocks noChangeAspect="1"/>
+            </wp:cNvGraphicFramePr>
+            <a:graphic>
+              <a:graphicData uri="http://schemas.openxmlformats.org/drawingml/2006/picture">
+                <pic:pic>
+                  <pic:nvPicPr>
+                    <pic:cNvPr id="0" name="fam_deepseek.png"/>
+                    <pic:cNvPicPr/>
+                  </pic:nvPicPr>
+                  <pic:blipFill>
+                    <a:blip r:embed="rId21"/>
+                    <a:stretch>
+                      <a:fillRect/>
+                    </a:stretch>
+                  </pic:blipFill>
+                  <pic:spPr>
+                    <a:xfrm>
+                      <a:off x="0" y="0"/>
+                      <a:ext cx="5394960" cy="3285372"/>
+                    </a:xfrm>
+                    <a:prstGeom prst="rect"/>
+                  </pic:spPr>
+                </pic:pic>
+              </a:graphicData>
+            </a:graphic>
+          </wp:inline>
+        </w:drawing>
+      </w:r>
+    </w:p>
+    <w:p>
+      <w:pPr>
+        <w:jc w:val="center"/>
+      </w:pPr>
+      <w:r>
+        <w:rPr>
+          <w:i/>
+          <w:color w:val="52514E"/>
+          <w:sz w:val="17"/>
+        </w:rPr>
+        <w:t>DeepSeek: 8 of 10 models misidentified at least once (2 always self-identified); most-claimed: ChatGPT, Claude.</w:t>
+      </w:r>
+    </w:p>
+    <w:p>
+      <w:pPr>
+        <w:jc w:val="center"/>
+      </w:pPr>
+      <w:r>
+        <w:drawing>
+          <wp:inline xmlns:a="http://schemas.openxmlformats.org/drawingml/2006/main" xmlns:pic="http://schemas.openxmlformats.org/drawingml/2006/picture">
+            <wp:extent cx="5394960" cy="2353718"/>
+            <wp:docPr id="14" name="Picture 14"/>
+            <wp:cNvGraphicFramePr>
+              <a:graphicFrameLocks noChangeAspect="1"/>
+            </wp:cNvGraphicFramePr>
+            <a:graphic>
+              <a:graphicData uri="http://schemas.openxmlformats.org/drawingml/2006/picture">
+                <pic:pic>
+                  <pic:nvPicPr>
+                    <pic:cNvPr id="0" name="fam_tencent.png"/>
+                    <pic:cNvPicPr/>
+                  </pic:nvPicPr>
+                  <pic:blipFill>
+                    <a:blip r:embed="rId22"/>
+                    <a:stretch>
+                      <a:fillRect/>
+                    </a:stretch>
+                  </pic:blipFill>
+                  <pic:spPr>
+                    <a:xfrm>
+                      <a:off x="0" y="0"/>
+                      <a:ext cx="5394960" cy="2353718"/>
+                    </a:xfrm>
+                    <a:prstGeom prst="rect"/>
+                  </pic:spPr>
+                </pic:pic>
+              </a:graphicData>
+            </a:graphic>
+          </wp:inline>
+        </w:drawing>
+      </w:r>
+    </w:p>
+    <w:p>
+      <w:pPr>
+        <w:jc w:val="center"/>
+      </w:pPr>
+      <w:r>
+        <w:rPr>
+          <w:i/>
+          <w:color w:val="52514E"/>
+          <w:sz w:val="17"/>
+        </w:rPr>
+        <w:t>Tencent (Hunyuan): 2 of 2 models misidentified at least once; most-claimed: halluc./other, Claude.</w:t>
+      </w:r>
+    </w:p>
+    <w:p>
+      <w:pPr>
+        <w:jc w:val="center"/>
+      </w:pPr>
+      <w:r>
+        <w:drawing>
+          <wp:inline xmlns:a="http://schemas.openxmlformats.org/drawingml/2006/main" xmlns:pic="http://schemas.openxmlformats.org/drawingml/2006/picture">
+            <wp:extent cx="5394960" cy="2728172"/>
+            <wp:docPr id="15" name="Picture 15"/>
+            <wp:cNvGraphicFramePr>
+              <a:graphicFrameLocks noChangeAspect="1"/>
+            </wp:cNvGraphicFramePr>
+            <a:graphic>
+              <a:graphicData uri="http://schemas.openxmlformats.org/drawingml/2006/picture">
+                <pic:pic>
+                  <pic:nvPicPr>
+                    <pic:cNvPr id="0" name="fam_anthropic.png"/>
+                    <pic:cNvPicPr/>
+                  </pic:nvPicPr>
+                  <pic:blipFill>
+                    <a:blip r:embed="rId23"/>
+                    <a:stretch>
+                      <a:fillRect/>
+                    </a:stretch>
+                  </pic:blipFill>
+                  <pic:spPr>
+                    <a:xfrm>
+                      <a:off x="0" y="0"/>
+                      <a:ext cx="5394960" cy="2728172"/>
+                    </a:xfrm>
+                    <a:prstGeom prst="rect"/>
+                  </pic:spPr>
+                </pic:pic>
+              </a:graphicData>
+            </a:graphic>
+          </wp:inline>
+        </w:drawing>
+      </w:r>
+    </w:p>
+    <w:p>
+      <w:pPr>
+        <w:jc w:val="center"/>
+      </w:pPr>
+      <w:r>
+        <w:rPr>
+          <w:i/>
+          <w:color w:val="52514E"/>
+          <w:sz w:val="17"/>
+        </w:rPr>
+        <w:t>Anthropic (Claude): 4 of 14 models misidentified at least once (10 always self-identified); most-claimed: ChatGPT, DeepSeek.</w:t>
+      </w:r>
+    </w:p>
+    <w:p>
+      <w:pPr>
+        <w:jc w:val="center"/>
+      </w:pPr>
+      <w:r>
+        <w:drawing>
+          <wp:inline xmlns:a="http://schemas.openxmlformats.org/drawingml/2006/main" xmlns:pic="http://schemas.openxmlformats.org/drawingml/2006/picture">
+            <wp:extent cx="5394960" cy="2578216"/>
+            <wp:docPr id="16" name="Picture 16"/>
+            <wp:cNvGraphicFramePr>
+              <a:graphicFrameLocks noChangeAspect="1"/>
+            </wp:cNvGraphicFramePr>
+            <a:graphic>
+              <a:graphicData uri="http://schemas.openxmlformats.org/drawingml/2006/picture">
+                <pic:pic>
+                  <pic:nvPicPr>
+                    <pic:cNvPr id="0" name="fam_amazon.png"/>
+                    <pic:cNvPicPr/>
+                  </pic:nvPicPr>
+                  <pic:blipFill>
+                    <a:blip r:embed="rId24"/>
+                    <a:stretch>
+                      <a:fillRect/>
+                    </a:stretch>
+                  </pic:blipFill>
+                  <pic:spPr>
+                    <a:xfrm>
+                      <a:off x="0" y="0"/>
+                      <a:ext cx="5394960" cy="2578216"/>
+                    </a:xfrm>
+                    <a:prstGeom prst="rect"/>
+                  </pic:spPr>
+                </pic:pic>
+              </a:graphicData>
+            </a:graphic>
+          </wp:inline>
+        </w:drawing>
+      </w:r>
+    </w:p>
+    <w:p>
+      <w:pPr>
+        <w:jc w:val="center"/>
+      </w:pPr>
+      <w:r>
+        <w:rPr>
+          <w:i/>
+          <w:color w:val="52514E"/>
+          <w:sz w:val="17"/>
+        </w:rPr>
+        <w:t>Amazon (Nova): 3 of 3 models misidentified at least once; most-claimed: halluc./other, other lab.</w:t>
+      </w:r>
+    </w:p>
+    <w:p>
+      <w:pPr>
+        <w:jc w:val="center"/>
+      </w:pPr>
+      <w:r>
+        <w:drawing>
+          <wp:inline xmlns:a="http://schemas.openxmlformats.org/drawingml/2006/main" xmlns:pic="http://schemas.openxmlformats.org/drawingml/2006/picture">
+            <wp:extent cx="5394960" cy="4857221"/>
+            <wp:docPr id="17" name="Picture 17"/>
+            <wp:cNvGraphicFramePr>
+              <a:graphicFrameLocks noChangeAspect="1"/>
+            </wp:cNvGraphicFramePr>
+            <a:graphic>
+              <a:graphicData uri="http://schemas.openxmlformats.org/drawingml/2006/picture">
+                <pic:pic>
+                  <pic:nvPicPr>
+                    <pic:cNvPr id="0" name="fam_openai.png"/>
+                    <pic:cNvPicPr/>
+                  </pic:nvPicPr>
+                  <pic:blipFill>
+                    <a:blip r:embed="rId25"/>
+                    <a:stretch>
+                      <a:fillRect/>
+                    </a:stretch>
+                  </pic:blipFill>
+                  <pic:spPr>
+                    <a:xfrm>
+                      <a:off x="0" y="0"/>
+                      <a:ext cx="5394960" cy="4857221"/>
+                    </a:xfrm>
+                    <a:prstGeom prst="rect"/>
+                  </pic:spPr>
+                </pic:pic>
+              </a:graphicData>
+            </a:graphic>
+          </wp:inline>
+        </w:drawing>
+      </w:r>
+    </w:p>
+    <w:p>
+      <w:pPr>
+        <w:jc w:val="center"/>
+      </w:pPr>
+      <w:r>
+        <w:rPr>
+          <w:i/>
+          <w:color w:val="52514E"/>
+          <w:sz w:val="17"/>
+        </w:rPr>
+        <w:t>OpenAI (GPT / o-series): 13 of 29 models misidentified at least once (16 always self-identified); most-claimed: halluc./other, Gemini.</w:t>
+      </w:r>
+    </w:p>
+    <w:p>
+      <w:pPr>
+        <w:jc w:val="center"/>
+      </w:pPr>
+      <w:r>
+        <w:drawing>
+          <wp:inline xmlns:a="http://schemas.openxmlformats.org/drawingml/2006/main" xmlns:pic="http://schemas.openxmlformats.org/drawingml/2006/picture">
+            <wp:extent cx="5394960" cy="2459251"/>
+            <wp:docPr id="18" name="Picture 18"/>
+            <wp:cNvGraphicFramePr>
+              <a:graphicFrameLocks noChangeAspect="1"/>
+            </wp:cNvGraphicFramePr>
+            <a:graphic>
+              <a:graphicData uri="http://schemas.openxmlformats.org/drawingml/2006/picture">
+                <pic:pic>
+                  <pic:nvPicPr>
+                    <pic:cNvPr id="0" name="fam_perplexity.png"/>
+                    <pic:cNvPicPr/>
+                  </pic:nvPicPr>
+                  <pic:blipFill>
+                    <a:blip r:embed="rId26"/>
+                    <a:stretch>
+                      <a:fillRect/>
+                    </a:stretch>
+                  </pic:blipFill>
+                  <pic:spPr>
+                    <a:xfrm>
+                      <a:off x="0" y="0"/>
+                      <a:ext cx="5394960" cy="2459251"/>
+                    </a:xfrm>
+                    <a:prstGeom prst="rect"/>
+                  </pic:spPr>
+                </pic:pic>
+              </a:graphicData>
+            </a:graphic>
+          </wp:inline>
+        </w:drawing>
+      </w:r>
+    </w:p>
+    <w:p>
+      <w:pPr>
+        <w:jc w:val="center"/>
+      </w:pPr>
+      <w:r>
+        <w:rPr>
+          <w:i/>
+          <w:color w:val="52514E"/>
+          <w:sz w:val="17"/>
+        </w:rPr>
+        <w:t>Perplexity (Sonar): 2 of 2 models misidentified at least once; most-claimed: ChatGPT, halluc./other.</w:t>
+      </w:r>
+    </w:p>
+    <w:p>
+      <w:pPr>
+        <w:jc w:val="center"/>
+      </w:pPr>
+      <w:r>
+        <w:drawing>
+          <wp:inline xmlns:a="http://schemas.openxmlformats.org/drawingml/2006/main" xmlns:pic="http://schemas.openxmlformats.org/drawingml/2006/picture">
+            <wp:extent cx="5394960" cy="3509549"/>
+            <wp:docPr id="19" name="Picture 19"/>
+            <wp:cNvGraphicFramePr>
+              <a:graphicFrameLocks noChangeAspect="1"/>
+            </wp:cNvGraphicFramePr>
+            <a:graphic>
+              <a:graphicData uri="http://schemas.openxmlformats.org/drawingml/2006/picture">
+                <pic:pic>
+                  <pic:nvPicPr>
+                    <pic:cNvPr id="0" name="fam_zhipu.png"/>
+                    <pic:cNvPicPr/>
+                  </pic:nvPicPr>
+                  <pic:blipFill>
+                    <a:blip r:embed="rId27"/>
+                    <a:stretch>
+                      <a:fillRect/>
+                    </a:stretch>
+                  </pic:blipFill>
+                  <pic:spPr>
+                    <a:xfrm>
+                      <a:off x="0" y="0"/>
+                      <a:ext cx="5394960" cy="3509549"/>
+                    </a:xfrm>
+                    <a:prstGeom prst="rect"/>
+                  </pic:spPr>
+                </pic:pic>
+              </a:graphicData>
+            </a:graphic>
+          </wp:inline>
+        </w:drawing>
+      </w:r>
+    </w:p>
+    <w:p>
+      <w:pPr>
+        <w:jc w:val="center"/>
+      </w:pPr>
+      <w:r>
+        <w:rPr>
+          <w:i/>
+          <w:color w:val="52514E"/>
+          <w:sz w:val="17"/>
+        </w:rPr>
+        <w:t>Zhipu (GLM): 7 of 9 models misidentified at least once (2 always self-identified); most-claimed: halluc./other, Claude.</w:t>
+      </w:r>
+    </w:p>
+    <w:p>
+      <w:pPr>
+        <w:jc w:val="center"/>
+      </w:pPr>
+      <w:r>
+        <w:drawing>
+          <wp:inline xmlns:a="http://schemas.openxmlformats.org/drawingml/2006/main" xmlns:pic="http://schemas.openxmlformats.org/drawingml/2006/picture">
+            <wp:extent cx="5394960" cy="2453772"/>
+            <wp:docPr id="20" name="Picture 20"/>
+            <wp:cNvGraphicFramePr>
+              <a:graphicFrameLocks noChangeAspect="1"/>
+            </wp:cNvGraphicFramePr>
+            <a:graphic>
+              <a:graphicData uri="http://schemas.openxmlformats.org/drawingml/2006/picture">
+                <pic:pic>
+                  <pic:nvPicPr>
+                    <pic:cNvPr id="0" name="fam_google.png"/>
+                    <pic:cNvPicPr/>
+                  </pic:nvPicPr>
+                  <pic:blipFill>
+                    <a:blip r:embed="rId28"/>
+                    <a:stretch>
+                      <a:fillRect/>
+                    </a:stretch>
+                  </pic:blipFill>
+                  <pic:spPr>
+                    <a:xfrm>
+                      <a:off x="0" y="0"/>
+                      <a:ext cx="5394960" cy="2453772"/>
+                    </a:xfrm>
+                    <a:prstGeom prst="rect"/>
+                  </pic:spPr>
+                </pic:pic>
+              </a:graphicData>
+            </a:graphic>
+          </wp:inline>
+        </w:drawing>
+      </w:r>
+    </w:p>
+    <w:p>
+      <w:pPr>
+        <w:jc w:val="center"/>
+      </w:pPr>
+      <w:r>
+        <w:rPr>
+          <w:i/>
+          <w:color w:val="52514E"/>
+          <w:sz w:val="17"/>
+        </w:rPr>
+        <w:t>Google (Gemini): 3 of 10 models misidentified at least once (7 always self-identified); most-claimed: ChatGPT, halluc./other.</w:t>
+      </w:r>
+    </w:p>
+    <w:p>
+      <w:pPr>
+        <w:jc w:val="center"/>
+      </w:pPr>
+      <w:r>
+        <w:drawing>
+          <wp:inline xmlns:a="http://schemas.openxmlformats.org/drawingml/2006/main" xmlns:pic="http://schemas.openxmlformats.org/drawingml/2006/picture">
+            <wp:extent cx="5394960" cy="2584412"/>
+            <wp:docPr id="21" name="Picture 21"/>
+            <wp:cNvGraphicFramePr>
+              <a:graphicFrameLocks noChangeAspect="1"/>
+            </wp:cNvGraphicFramePr>
+            <a:graphic>
+              <a:graphicData uri="http://schemas.openxmlformats.org/drawingml/2006/picture">
+                <pic:pic>
+                  <pic:nvPicPr>
+                    <pic:cNvPr id="0" name="fam_cohere.png"/>
+                    <pic:cNvPicPr/>
+                  </pic:nvPicPr>
+                  <pic:blipFill>
+                    <a:blip r:embed="rId29"/>
+                    <a:stretch>
+                      <a:fillRect/>
+                    </a:stretch>
+                  </pic:blipFill>
+                  <pic:spPr>
+                    <a:xfrm>
+                      <a:off x="0" y="0"/>
+                      <a:ext cx="5394960" cy="2584412"/>
+                    </a:xfrm>
+                    <a:prstGeom prst="rect"/>
+                  </pic:spPr>
+                </pic:pic>
+              </a:graphicData>
+            </a:graphic>
+          </wp:inline>
+        </w:drawing>
+      </w:r>
+    </w:p>
+    <w:p>
+      <w:pPr>
+        <w:jc w:val="center"/>
+      </w:pPr>
+      <w:r>
+        <w:rPr>
+          <w:i/>
+          <w:color w:val="52514E"/>
+          <w:sz w:val="17"/>
+        </w:rPr>
+        <w:t>Cohere (Command / Aya): 4 of 5 models misidentified at least once (1 always self-identified); most-claimed: halluc./other, ChatGPT.</w:t>
+      </w:r>
+    </w:p>
+    <w:p>
+      <w:pPr>
+        <w:jc w:val="center"/>
+      </w:pPr>
+      <w:r>
+        <w:drawing>
+          <wp:inline xmlns:a="http://schemas.openxmlformats.org/drawingml/2006/main" xmlns:pic="http://schemas.openxmlformats.org/drawingml/2006/picture">
+            <wp:extent cx="5394960" cy="2590004"/>
+            <wp:docPr id="22" name="Picture 22"/>
+            <wp:cNvGraphicFramePr>
+              <a:graphicFrameLocks noChangeAspect="1"/>
+            </wp:cNvGraphicFramePr>
+            <a:graphic>
+              <a:graphicData uri="http://schemas.openxmlformats.org/drawingml/2006/picture">
+                <pic:pic>
+                  <pic:nvPicPr>
+                    <pic:cNvPr id="0" name="fam_gemma.png"/>
+                    <pic:cNvPicPr/>
+                  </pic:nvPicPr>
+                  <pic:blipFill>
+                    <a:blip r:embed="rId30"/>
+                    <a:stretch>
+                      <a:fillRect/>
+                    </a:stretch>
+                  </pic:blipFill>
+                  <pic:spPr>
+                    <a:xfrm>
+                      <a:off x="0" y="0"/>
+                      <a:ext cx="5394960" cy="2590004"/>
+                    </a:xfrm>
+                    <a:prstGeom prst="rect"/>
+                  </pic:spPr>
+                </pic:pic>
+              </a:graphicData>
+            </a:graphic>
+          </wp:inline>
+        </w:drawing>
+      </w:r>
+    </w:p>
+    <w:p>
+      <w:pPr>
+        <w:jc w:val="center"/>
+      </w:pPr>
+      <w:r>
+        <w:rPr>
+          <w:i/>
+          <w:color w:val="52514E"/>
+          <w:sz w:val="17"/>
+        </w:rPr>
+        <w:t>Google (Gemma): 3 of 4 models misidentified at least once (1 always self-identified); most-claimed: halluc./other, Gemini.</w:t>
+      </w:r>
+    </w:p>
+    <w:p>
+      <w:pPr>
+        <w:jc w:val="center"/>
+      </w:pPr>
+      <w:r>
+        <w:drawing>
+          <wp:inline xmlns:a="http://schemas.openxmlformats.org/drawingml/2006/main" xmlns:pic="http://schemas.openxmlformats.org/drawingml/2006/picture">
+            <wp:extent cx="5394960" cy="2378461"/>
+            <wp:docPr id="23" name="Picture 23"/>
+            <wp:cNvGraphicFramePr>
+              <a:graphicFrameLocks noChangeAspect="1"/>
+            </wp:cNvGraphicFramePr>
+            <a:graphic>
+              <a:graphicData uri="http://schemas.openxmlformats.org/drawingml/2006/picture">
+                <pic:pic>
+                  <pic:nvPicPr>
+                    <pic:cNvPr id="0" name="fam_ant.png"/>
+                    <pic:cNvPicPr/>
+                  </pic:nvPicPr>
+                  <pic:blipFill>
+                    <a:blip r:embed="rId31"/>
+                    <a:stretch>
+                      <a:fillRect/>
+                    </a:stretch>
+                  </pic:blipFill>
+                  <pic:spPr>
+                    <a:xfrm>
+                      <a:off x="0" y="0"/>
+                      <a:ext cx="5394960" cy="2378461"/>
+                    </a:xfrm>
+                    <a:prstGeom prst="rect"/>
+                  </pic:spPr>
+                </pic:pic>
+              </a:graphicData>
+            </a:graphic>
+          </wp:inline>
+        </w:drawing>
+      </w:r>
+    </w:p>
+    <w:p>
+      <w:pPr>
+        <w:jc w:val="center"/>
+      </w:pPr>
+      <w:r>
+        <w:rPr>
+          <w:i/>
+          <w:color w:val="52514E"/>
+          <w:sz w:val="17"/>
+        </w:rPr>
+        <w:t>Ant (Ling / Ring): 2 of 3 models misidentified at least once (1 always self-identified); most-claimed: halluc./other, Qwen.</w:t>
+      </w:r>
+    </w:p>
+    <w:p>
+      <w:pPr>
+        <w:jc w:val="center"/>
+      </w:pPr>
+      <w:r>
+        <w:drawing>
+          <wp:inline xmlns:a="http://schemas.openxmlformats.org/drawingml/2006/main" xmlns:pic="http://schemas.openxmlformats.org/drawingml/2006/picture">
+            <wp:extent cx="5394960" cy="2173767"/>
+            <wp:docPr id="24" name="Picture 24"/>
+            <wp:cNvGraphicFramePr>
+              <a:graphicFrameLocks noChangeAspect="1"/>
+            </wp:cNvGraphicFramePr>
+            <a:graphic>
+              <a:graphicData uri="http://schemas.openxmlformats.org/drawingml/2006/picture">
+                <pic:pic>
+                  <pic:nvPicPr>
+                    <pic:cNvPr id="0" name="fam_nex.png"/>
+                    <pic:cNvPicPr/>
+                  </pic:nvPicPr>
+                  <pic:blipFill>
+                    <a:blip r:embed="rId32"/>
+                    <a:stretch>
+                      <a:fillRect/>
+                    </a:stretch>
+                  </pic:blipFill>
+                  <pic:spPr>
+                    <a:xfrm>
+                      <a:off x="0" y="0"/>
+                      <a:ext cx="5394960" cy="2173767"/>
+                    </a:xfrm>
+                    <a:prstGeom prst="rect"/>
+                  </pic:spPr>
+                </pic:pic>
+              </a:graphicData>
+            </a:graphic>
+          </wp:inline>
+        </w:drawing>
+      </w:r>
+    </w:p>
+    <w:p>
+      <w:pPr>
+        <w:jc w:val="center"/>
+      </w:pPr>
+      <w:r>
+        <w:rPr>
+          <w:i/>
+          <w:color w:val="52514E"/>
+          <w:sz w:val="17"/>
+        </w:rPr>
+        <w:t>nex: 1 of 2 models misidentified at least once (1 always self-identified); most-claimed: ChatGPT, Qwen.</w:t>
+      </w:r>
+    </w:p>
+    <w:p>
+      <w:pPr>
+        <w:jc w:val="center"/>
+      </w:pPr>
+      <w:r>
+        <w:drawing>
+          <wp:inline xmlns:a="http://schemas.openxmlformats.org/drawingml/2006/main" xmlns:pic="http://schemas.openxmlformats.org/drawingml/2006/picture">
+            <wp:extent cx="5394960" cy="3858647"/>
+            <wp:docPr id="25" name="Picture 25"/>
+            <wp:cNvGraphicFramePr>
+              <a:graphicFrameLocks noChangeAspect="1"/>
+            </wp:cNvGraphicFramePr>
+            <a:graphic>
+              <a:graphicData uri="http://schemas.openxmlformats.org/drawingml/2006/picture">
+                <pic:pic>
+                  <pic:nvPicPr>
+                    <pic:cNvPr id="0" name="fam_zzz_singles.png"/>
+                    <pic:cNvPicPr/>
+                  </pic:nvPicPr>
+                  <pic:blipFill>
+                    <a:blip r:embed="rId33"/>
+                    <a:stretch>
+                      <a:fillRect/>
+                    </a:stretch>
+                  </pic:blipFill>
+                  <pic:spPr>
+                    <a:xfrm>
+                      <a:off x="0" y="0"/>
+                      <a:ext cx="5394960" cy="3858647"/>
+                    </a:xfrm>
+                    <a:prstGeom prst="rect"/>
+                  </pic:spPr>
+                </pic:pic>
+              </a:graphicData>
+            </a:graphic>
+          </wp:inline>
+        </w:drawing>
+      </w:r>
+    </w:p>
+    <w:p>
+      <w:pPr>
+        <w:jc w:val="center"/>
+      </w:pPr>
+      <w:r>
+        <w:rPr>
+          <w:i/>
+          <w:color w:val="52514E"/>
+          <w:sz w:val="17"/>
+        </w:rPr>
+        <w:t>Single-model &amp; long-tail labs (10 models): includes Perceptron Mk1, Tencent Hy3, and other one-off labs that misidentified.</w:t>
+      </w:r>
+    </w:p>
+    <w:p>
+      <w:pPr>
         <w:pStyle w:val="Heading1"/>
       </w:pPr>
       <w:r>
@@ -596,7 +1649,7 @@
         <w:drawing>
           <wp:inline xmlns:a="http://schemas.openxmlformats.org/drawingml/2006/main" xmlns:pic="http://schemas.openxmlformats.org/drawingml/2006/picture">
             <wp:extent cx="5852160" cy="3648293"/>
-            <wp:docPr id="6" name="Picture 6"/>
+            <wp:docPr id="26" name="Picture 26"/>
             <wp:cNvGraphicFramePr>
               <a:graphicFrameLocks noChangeAspect="1"/>
             </wp:cNvGraphicFramePr>
@@ -608,7 +1661,7 @@
                     <pic:cNvPicPr/>
                   </pic:nvPicPr>
                   <pic:blipFill>
-                    <a:blip r:embed="rId14"/>
+                    <a:blip r:embed="rId34"/>
                     <a:stretch>
                       <a:fillRect/>
                     </a:stretch>
@@ -670,7 +1723,7 @@
         <w:drawing>
           <wp:inline xmlns:a="http://schemas.openxmlformats.org/drawingml/2006/main" xmlns:pic="http://schemas.openxmlformats.org/drawingml/2006/picture">
             <wp:extent cx="5852160" cy="2988541"/>
-            <wp:docPr id="7" name="Picture 7"/>
+            <wp:docPr id="27" name="Picture 27"/>
             <wp:cNvGraphicFramePr>
               <a:graphicFrameLocks noChangeAspect="1"/>
             </wp:cNvGraphicFramePr>
@@ -682,7 +1735,7 @@
                     <pic:cNvPicPr/>
                   </pic:nvPicPr>
                   <pic:blipFill>
-                    <a:blip r:embed="rId15"/>
+                    <a:blip r:embed="rId35"/>
                     <a:stretch>
                       <a:fillRect/>
                     </a:stretch>
@@ -758,7 +1811,7 @@
         <w:drawing>
           <wp:inline xmlns:a="http://schemas.openxmlformats.org/drawingml/2006/main" xmlns:pic="http://schemas.openxmlformats.org/drawingml/2006/picture">
             <wp:extent cx="5852160" cy="2739820"/>
-            <wp:docPr id="8" name="Picture 8"/>
+            <wp:docPr id="28" name="Picture 28"/>
             <wp:cNvGraphicFramePr>
               <a:graphicFrameLocks noChangeAspect="1"/>
             </wp:cNvGraphicFramePr>
@@ -770,7 +1823,7 @@
                     <pic:cNvPicPr/>
                   </pic:nvPicPr>
                   <pic:blipFill>
-                    <a:blip r:embed="rId16"/>
+                    <a:blip r:embed="rId36"/>
                     <a:stretch>
                       <a:fillRect/>
                     </a:stretch>
@@ -902,7 +1955,7 @@
         <w:drawing>
           <wp:inline xmlns:a="http://schemas.openxmlformats.org/drawingml/2006/main" xmlns:pic="http://schemas.openxmlformats.org/drawingml/2006/picture">
             <wp:extent cx="5852160" cy="3016952"/>
-            <wp:docPr id="9" name="Picture 9"/>
+            <wp:docPr id="29" name="Picture 29"/>
             <wp:cNvGraphicFramePr>
               <a:graphicFrameLocks noChangeAspect="1"/>
             </wp:cNvGraphicFramePr>
@@ -914,7 +1967,7 @@
                     <pic:cNvPicPr/>
                   </pic:nvPicPr>
                   <pic:blipFill>
-                    <a:blip r:embed="rId17"/>
+                    <a:blip r:embed="rId37"/>
                     <a:stretch>
                       <a:fillRect/>
                     </a:stretch>

</xml_diff>